<commit_message>
120: remove client pilot sections
</commit_message>
<xml_diff>
--- a/docs/skillsgap-client-readout.docx
+++ b/docs/skillsgap-client-readout.docx
@@ -273,39 +273,7 @@
             <w:rFonts w:ascii="Arial" w:hAnsi="Arial"/>
             <w:sz w:val="20"/>
           </w:rPr>
-          <w:t>9 Proposed client working model</w:t>
-        </w:r>
-      </w:hyperlink>
-    </w:p>
-    <w:p>
-      <w:pPr>
-        <w:spacing w:after="20"/>
-        <w:ind w:left="173"/>
-      </w:pPr>
-      <w:hyperlink w:anchor="sg_section_10" w:history="1">
-        <w:r>
-          <w:rPr>
-            <w:color w:val="000000"/>
-            <w:rFonts w:ascii="Arial" w:hAnsi="Arial"/>
-            <w:sz w:val="20"/>
-          </w:rPr>
-          <w:t>10 Decisions before a pilot</w:t>
-        </w:r>
-      </w:hyperlink>
-    </w:p>
-    <w:p>
-      <w:pPr>
-        <w:spacing w:after="20"/>
-        <w:ind w:left="173"/>
-      </w:pPr>
-      <w:hyperlink w:anchor="sg_section_11" w:history="1">
-        <w:r>
-          <w:rPr>
-            <w:color w:val="000000"/>
-            <w:rFonts w:ascii="Arial" w:hAnsi="Arial"/>
-            <w:sz w:val="20"/>
-          </w:rPr>
-          <w:t>11 Terms used in this readout</w:t>
+          <w:t>9 Terms used in this readout</w:t>
         </w:r>
       </w:hyperlink>
     </w:p>
@@ -1495,208 +1463,6 @@
       </w:r>
     </w:p>
     <w:p>
-      <w:pPr>
-        <w:pStyle w:val="Heading1"/>
-      </w:pPr>
-      <w:bookmarkStart w:id="9" w:name="sg_section_09"/>
-      <w:r>
-        <w:t>9 Proposed client working model</w:t>
-      </w:r>
-      <w:bookmarkEnd w:id="9"/>
-    </w:p>
-    <w:p>
-      <w:pPr>
-        <w:keepLines/>
-      </w:pPr>
-      <w:r>
-        <w:t>We propose a pilot that starts with a clearly bounded set of roles or career routes, a named owner for each data source, and an end-to-end check of the exact environment the client will use. The software can support the steps below; the accountabilities and service commitments still need agreement.</w:t>
-      </w:r>
-    </w:p>
-    <w:p>
-      <w:pPr>
-        <w:pStyle w:val="Heading2"/>
-      </w:pPr>
-      <w:r>
-        <w:t>Before the pilot</w:t>
-      </w:r>
-    </w:p>
-    <w:p>
-      <w:pPr>
-        <w:pStyle w:val="ListBullet"/>
-        <w:keepLines/>
-      </w:pPr>
-      <w:r>
-        <w:t>Agree the target roles or occupations, the participant group, and which organization is acting as employer, training provider, or coordinating partner.</w:t>
-      </w:r>
-    </w:p>
-    <w:p>
-      <w:pPr>
-        <w:pStyle w:val="ListBullet"/>
-        <w:keepLines/>
-      </w:pPr>
-      <w:r>
-        <w:t>Have the employer approve role descriptions, active requirements, qualification mappings, minimum experience, weights, mandatory conditions, and the application threshold.</w:t>
-      </w:r>
-    </w:p>
-    <w:p>
-      <w:pPr>
-        <w:pStyle w:val="ListBullet"/>
-        <w:keepLines/>
-      </w:pPr>
-      <w:r>
-        <w:t>Have providers confirm program details, entry rules, schedule, location, fees, intake status, contact link, and mapped outcomes.</w:t>
-      </w:r>
-    </w:p>
-    <w:p>
-      <w:pPr>
-        <w:pStyle w:val="ListBullet"/>
-        <w:keepLines/>
-      </w:pPr>
-      <w:r>
-        <w:t>Confirm which catalogue records are current, which are demonstration data, and who reviews changes and stale records.</w:t>
-      </w:r>
-    </w:p>
-    <w:p>
-      <w:pPr>
-        <w:pStyle w:val="ListBullet"/>
-        <w:keepLines/>
-      </w:pPr>
-      <w:r>
-        <w:t>Select and test the private processor and vision endpoint. Confirm image handling, retention terms, access, monitoring, and applicant notice.</w:t>
-      </w:r>
-    </w:p>
-    <w:p>
-      <w:pPr>
-        <w:pStyle w:val="ListBullet"/>
-        <w:keepLines/>
-      </w:pPr>
-      <w:r>
-        <w:t>Rehearse the applicant journey, review and correction flow, role match, application, consent, and interview workflow with test data approved for that purpose.</w:t>
-      </w:r>
-    </w:p>
-    <w:p>
-      <w:pPr>
-        <w:pStyle w:val="Heading2"/>
-      </w:pPr>
-      <w:r>
-        <w:t>During the pilot</w:t>
-      </w:r>
-    </w:p>
-    <w:p>
-      <w:pPr>
-        <w:keepLines/>
-      </w:pPr>
-      <w:r>
-        <w:t>Applicants should be able to choose a CV route or a no-CV route, review any suggested qualifications, and understand that plans and unconfirmed findings do not count as confirmed skills. Employers should keep roles current and use the role-specific candidate and consent controls. Providers should update program availability before dates, prices, or entry conditions are presented as current.</w:t>
-      </w:r>
-    </w:p>
-    <w:p>
-      <w:pPr>
-        <w:pStyle w:val="Heading2"/>
-      </w:pPr>
-      <w:r>
-        <w:t>At each review</w:t>
-      </w:r>
-    </w:p>
-    <w:p>
-      <w:pPr>
-        <w:keepLines/>
-      </w:pPr>
-      <w:r>
-        <w:t>We should review vacancy and training freshness, queued or failed CV jobs, participant corrections, applications, interview invitations, and training referrals. Agree which measures are useful and who receives them. A dedicated client analytics workspace is not evidenced in the current repository, so any custom report needs to be scoped separately.</w:t>
-      </w:r>
-    </w:p>
-    <w:p>
-      <w:pPr>
-        <w:pStyle w:val="Heading1"/>
-      </w:pPr>
-      <w:bookmarkStart w:id="10" w:name="sg_section_10"/>
-      <w:r>
-        <w:t>10 Decisions before a pilot</w:t>
-      </w:r>
-      <w:bookmarkEnd w:id="10"/>
-    </w:p>
-    <w:p>
-      <w:pPr>
-        <w:keepLines/>
-      </w:pPr>
-      <w:r>
-        <w:t>A first working session should settle the following items:</w:t>
-      </w:r>
-    </w:p>
-    <w:p>
-      <w:pPr>
-        <w:pStyle w:val="ListBullet"/>
-        <w:keepLines/>
-      </w:pPr>
-      <w:r>
-        <w:t>Pilot scope, target occupations, participant group, and the client’s role in delivery.</w:t>
-      </w:r>
-    </w:p>
-    <w:p>
-      <w:pPr>
-        <w:pStyle w:val="ListBullet"/>
-        <w:keepLines/>
-      </w:pPr>
-      <w:r>
-        <w:t>Authoritative sources for job and training information, record approval, and review frequency.</w:t>
-      </w:r>
-    </w:p>
-    <w:p>
-      <w:pPr>
-        <w:pStyle w:val="ListBullet"/>
-        <w:keepLines/>
-      </w:pPr>
-      <w:r>
-        <w:t>Requirement definitions, weights, mandatory rules, experience thresholds, and who may change them.</w:t>
-      </w:r>
-    </w:p>
-    <w:p>
-      <w:pPr>
-        <w:pStyle w:val="ListBullet"/>
-        <w:keepLines/>
-      </w:pPr>
-      <w:r>
-        <w:t>Verification responsibilities for companies, providers, qualifications, and program outcomes.</w:t>
-      </w:r>
-    </w:p>
-    <w:p>
-      <w:pPr>
-        <w:pStyle w:val="ListBullet"/>
-        <w:keepLines/>
-      </w:pPr>
-      <w:r>
-        <w:t>Applicant consent wording, CV retention and deletion, data location, model endpoint, and any client privacy requirements.</w:t>
-      </w:r>
-    </w:p>
-    <w:p>
-      <w:pPr>
-        <w:pStyle w:val="ListBullet"/>
-        <w:keepLines/>
-      </w:pPr>
-      <w:r>
-        <w:t>Who monitors the processor queue, investigates failures, handles support, and confirms service availability.</w:t>
-      </w:r>
-    </w:p>
-    <w:p>
-      <w:pPr>
-        <w:pStyle w:val="ListBullet"/>
-        <w:keepLines/>
-      </w:pPr>
-      <w:r>
-        <w:t>Needed reporting, outcome measures, and whether separate client reporting work is required.</w:t>
-      </w:r>
-    </w:p>
-    <w:p>
-      <w:pPr>
-        <w:pStyle w:val="ListBullet"/>
-        <w:keepLines/>
-      </w:pPr>
-      <w:r>
-        <w:t>The live domain, sign-in redirects, and the exact environment to use for a client demonstration.</w:t>
-      </w:r>
-    </w:p>
-    <w:p>
       <w:r>
         <w:br w:type="page"/>
       </w:r>
@@ -1705,11 +1471,11 @@
       <w:pPr>
         <w:pStyle w:val="Heading1"/>
       </w:pPr>
-      <w:bookmarkStart w:id="11" w:name="sg_section_11"/>
+      <w:bookmarkStart w:id="9" w:name="sg_section_09"/>
       <w:r>
-        <w:t>11 Terms used in this readout</w:t>
+        <w:t>9 Terms used in this readout</w:t>
       </w:r>
-      <w:bookmarkEnd w:id="11"/>
+      <w:bookmarkEnd w:id="9"/>
     </w:p>
     <w:tbl>
       <w:tblPr>

</xml_diff>